<commit_message>
Pruebas con obras reales y citas literales (II): Bentham, el Quijote (Gutenberg y la grafía de 1608), Marianela, Mill, Darwin y la entrevista de 1892 a Conan Doyle sobre Joseph Bell; fuera Foucault, Arendt, Berlin, Rayuela, El perseguidor y las entrevistas inventadas a Cortázar y Cabral; el catálogo de RTVE, Wikidata y Open Library con sus datos reales; personas inventadas donde solo importa la mecánica
Co-Authored-By: Claude Opus 5.5 (1M context) <noreply@anthropic.com>
</commit_message>
<xml_diff>
--- a/packages/imprenta/test/fixtures/prueba.docx
+++ b/packages/imprenta/test/fixtures/prueba.docx
@@ -39,7 +39,7 @@
         <w:pStyle w:val="Cita"/>
       </w:pPr>
       <w:r>
-        <w:t xml:space="preserve">La visibilidad es una trampa.</w:t>
+        <w:t xml:space="preserve">The essence of it consists, then, in the centrality of the inspector’s situation, combined with the wellknown and most effectual contrivances for seeing without being seen.</w:t>
       </w:r>
     </w:p>
     <w:p>
@@ -63,7 +63,7 @@
   <w:footnote w:id="1">
     <w:p>
       <w:r>
-        <w:t>Foucault, Vigilar y castigar, p. 23.</w:t>
+        <w:t>Bentham, Panopticon, carta V.</w:t>
       </w:r>
     </w:p>
   </w:footnote>

</xml_diff>